<commit_message>
Move weapons and tactics training to elite section
Update category for "Weapons and Tactics" from "sport" to "elite" in data files and regenerate documentation.

Replit-Commit-Author: Agent
Replit-Commit-Session-Id: 43aedacb-9d22-48c3-86be-6e4194244c57
Replit-Commit-Checkpoint-Type: full_checkpoint
Replit-Commit-Event-Id: f98380ab-31eb-40b8-b7e9-ea4d8e9a57ab
Replit-Commit-Screenshot-Url: https://storage.googleapis.com/screenshot-production-us-central1/3aef1f33-446e-46d9-8cba-659142b2096e/43aedacb-9d22-48c3-86be-6e4194244c57/KoHBKjr
Replit-Helium-Checkpoint-Created: true
</commit_message>
<xml_diff>
--- a/Fury-Combat-Systems-Services.docx
+++ b/Fury-Combat-Systems-Services.docx
@@ -4400,48 +4400,6 @@
     </w:p>
     <w:p>
       <w:pPr>
-        <w:spacing w:before="200" w:after="20"/>
-      </w:pPr>
-      <w:r>
-        <w:rPr>
-          <w:b/>
-          <w:i w:val="0"/>
-          <w:color w:val="18181B"/>
-          <w:sz w:val="32"/>
-        </w:rPr>
-        <w:t>Martial Arts &amp; Combat Sports</w:t>
-      </w:r>
-    </w:p>
-    <w:p>
-      <w:pPr>
-        <w:spacing w:before="0" w:after="20"/>
-      </w:pPr>
-      <w:r>
-        <w:rPr>
-          <w:b/>
-          <w:i w:val="0"/>
-          <w:color w:val="DC2626"/>
-          <w:sz w:val="21"/>
-        </w:rPr>
-        <w:t>Competitive Martial Arts &amp; Sport Combat Training</w:t>
-      </w:r>
-    </w:p>
-    <w:p>
-      <w:pPr>
-        <w:spacing w:before="0" w:after="120"/>
-      </w:pPr>
-      <w:r>
-        <w:rPr>
-          <w:b w:val="0"/>
-          <w:i/>
-          <w:color w:val="52525B"/>
-          <w:sz w:val="20"/>
-        </w:rPr>
-        <w:t>Private competitive martial arts instruction in Brooklyn for adults and young athletes who want the sport side of the system, including MMA, Jujitsu, Kickboxing, Ninjutsu, Self Defense, and Weapons and Tactics.</w:t>
-      </w:r>
-    </w:p>
-    <w:p>
-      <w:pPr>
         <w:spacing w:before="160" w:after="20"/>
       </w:pPr>
       <w:r>
@@ -4451,7 +4409,7 @@
           <w:color w:val="18181B"/>
           <w:sz w:val="28"/>
         </w:rPr>
-        <w:t>9. Self Defense</w:t>
+        <w:t>9. Weapons and Tactics</w:t>
       </w:r>
     </w:p>
     <w:p>
@@ -4490,7 +4448,7 @@
           <w:i w:val="0"/>
           <w:sz w:val="20"/>
         </w:rPr>
-        <w:t>/self-defense-in-brooklyn</w:t>
+        <w:t>/weapons-and-tactics-in-brooklyn</w:t>
       </w:r>
     </w:p>
     <w:p>
@@ -4504,7 +4462,7 @@
           <w:color w:val="52525B"/>
           <w:sz w:val="21"/>
         </w:rPr>
-        <w:t>Private self defense training in Brooklyn built around awareness, prevention, and decisive real-world response.</w:t>
+        <w:t>Private weapons and tactics training in Brooklyn focused on awareness, control, and disciplined response.</w:t>
       </w:r>
     </w:p>
     <w:p>
@@ -4517,7 +4475,7 @@
           <w:i w:val="0"/>
           <w:sz w:val="21"/>
         </w:rPr>
-        <w:t>Self Defense training at Fury Combat Systems is built for real-world readiness. Clients learn practical awareness, prevention, hand-to-hand defense, decisive response, and the mental control needed to act under pressure. The goal is not fear-based training. The goal is confidence, preparation, and the ability to protect yourself and the people who matter to you.</w:t>
+        <w:t>Weapons and Tactics training at Fury Combat Systems introduces clients to practical awareness, tactical movement, weapons familiarity, and disciplined response. The focus is controlled, responsible instruction designed to build readiness, coordination, confidence, and a deeper understanding of real-world defensive situations.</w:t>
       </w:r>
     </w:p>
     <w:p>
@@ -4545,7 +4503,7 @@
           <w:i w:val="0"/>
           <w:sz w:val="20"/>
         </w:rPr>
-        <w:t>Adults seeking practical self defense in Brooklyn</w:t>
+        <w:t>Adults seeking weapons familiarity and tactical awareness</w:t>
       </w:r>
     </w:p>
     <w:p>
@@ -4559,7 +4517,7 @@
           <w:i w:val="0"/>
           <w:sz w:val="20"/>
         </w:rPr>
-        <w:t>Commuters and city residents focused on safety</w:t>
+        <w:t>Martial artists expanding their training</w:t>
       </w:r>
     </w:p>
     <w:p>
@@ -4573,7 +4531,7 @@
           <w:i w:val="0"/>
           <w:sz w:val="20"/>
         </w:rPr>
-        <w:t>Beginners with no prior training</w:t>
+        <w:t>Clients focused on serious personal readiness</w:t>
       </w:r>
     </w:p>
     <w:p>
@@ -4587,7 +4545,7 @@
           <w:i w:val="0"/>
           <w:sz w:val="20"/>
         </w:rPr>
-        <w:t>Women, parents, and professionals</w:t>
+        <w:t>Beginners wanting responsible, disciplined instruction</w:t>
       </w:r>
     </w:p>
     <w:p>
@@ -4601,7 +4559,7 @@
           <w:i w:val="0"/>
           <w:sz w:val="20"/>
         </w:rPr>
-        <w:t>Anyone wanting confidence and personal readiness</w:t>
+        <w:t>Experienced practitioners refining tactical skill</w:t>
       </w:r>
     </w:p>
     <w:p>
@@ -4629,7 +4587,7 @@
           <w:i w:val="0"/>
           <w:sz w:val="20"/>
         </w:rPr>
-        <w:t>Private one-on-one instruction with David Furie</w:t>
+        <w:t>Private weapons and tactics instruction with David Furie</w:t>
       </w:r>
     </w:p>
     <w:p>
@@ -4643,7 +4601,7 @@
           <w:i w:val="0"/>
           <w:sz w:val="20"/>
         </w:rPr>
-        <w:t>Awareness, prevention, and response coaching</w:t>
+        <w:t>Responsible, controlled introduction to weapons concepts</w:t>
       </w:r>
     </w:p>
     <w:p>
@@ -4657,7 +4615,7 @@
           <w:i w:val="0"/>
           <w:sz w:val="20"/>
         </w:rPr>
-        <w:t>Hands-on defensive skill development</w:t>
+        <w:t>Tactical movement and awareness drills</w:t>
       </w:r>
     </w:p>
     <w:p>
@@ -4671,7 +4629,7 @@
           <w:i w:val="0"/>
           <w:sz w:val="20"/>
         </w:rPr>
-        <w:t>Training scaled to your fitness and experience level</w:t>
+        <w:t>Coordination and timing development</w:t>
       </w:r>
     </w:p>
     <w:p>
@@ -4685,7 +4643,7 @@
           <w:i w:val="0"/>
           <w:sz w:val="20"/>
         </w:rPr>
-        <w:t>Practical tools you can use in real situations</w:t>
+        <w:t>A serious training experience shaped around your goals</w:t>
       </w:r>
     </w:p>
     <w:p>
@@ -4712,7 +4670,7 @@
           <w:i w:val="0"/>
           <w:sz w:val="20"/>
         </w:rPr>
-        <w:t>Situational awareness  •  Threat recognition  •  Defensive movement  •  Hand-to-hand protection  •  Using natural body weapons  •  Everyday-object awareness  •  Fear control  •  Confidence under pressure</w:t>
+        <w:t>Weapons familiarity  •  Tactical movement  •  Awareness and distance  •  Responsible control  •  Defensive positioning  •  Improvised-object awareness  •  Coordination and timing  •  Practical readiness</w:t>
       </w:r>
     </w:p>
     <w:p>
@@ -4740,7 +4698,7 @@
           <w:i w:val="0"/>
           <w:sz w:val="20"/>
         </w:rPr>
-        <w:t>Stronger awareness in everyday environments</w:t>
+        <w:t>Greater tactical awareness in real environments</w:t>
       </w:r>
     </w:p>
     <w:p>
@@ -4754,7 +4712,7 @@
           <w:i w:val="0"/>
           <w:sz w:val="20"/>
         </w:rPr>
-        <w:t>More confidence moving through Brooklyn and the city</w:t>
+        <w:t>Stronger discipline and control</w:t>
       </w:r>
     </w:p>
     <w:p>
@@ -4768,7 +4726,7 @@
           <w:i w:val="0"/>
           <w:sz w:val="20"/>
         </w:rPr>
-        <w:t>Practical defensive skill you can actually use</w:t>
+        <w:t>Improved coordination and timing</w:t>
       </w:r>
     </w:p>
     <w:p>
@@ -4782,7 +4740,7 @@
           <w:i w:val="0"/>
           <w:sz w:val="20"/>
         </w:rPr>
-        <w:t>Better composure under pressure</w:t>
+        <w:t>Better understanding of defensive movement</w:t>
       </w:r>
     </w:p>
     <w:p>
@@ -4796,7 +4754,7 @@
           <w:i w:val="0"/>
           <w:sz w:val="20"/>
         </w:rPr>
-        <w:t>A clearer mental framework for personal safety</w:t>
+        <w:t>A more complete personal readiness skill set</w:t>
       </w:r>
     </w:p>
     <w:p>
@@ -4823,7 +4781,7 @@
           <w:i w:val="0"/>
           <w:sz w:val="21"/>
         </w:rPr>
-        <w:t>This is real self defense built around awareness, prevention, and practical response, taught privately by Grandmaster Dr. David Furie. It is not a generic gym class and it is not fear-based training.</w:t>
+        <w:t>Weapons and Tactics training at Fury Combat is serious, controlled, and taught privately by Grandmaster Dr. David Furie. The focus is responsibility, awareness, and real skill, not flash.</w:t>
       </w:r>
     </w:p>
     <w:p>
@@ -4851,7 +4809,7 @@
           <w:color w:val="18181B"/>
           <w:sz w:val="20"/>
         </w:rPr>
-        <w:t>Q: Is this beginner-friendly?</w:t>
+        <w:t>Q: Is this safe for beginners?</w:t>
       </w:r>
     </w:p>
     <w:p>
@@ -4864,7 +4822,7 @@
           <w:i w:val="0"/>
           <w:sz w:val="20"/>
         </w:rPr>
-        <w:t>A: Yes. Every session is shaped around the client's level, with no prior experience required.</w:t>
+        <w:t>A: Yes. Training is responsible, controlled, and scaled to the client's level.</w:t>
       </w:r>
     </w:p>
     <w:p>
@@ -4878,7 +4836,7 @@
           <w:color w:val="18181B"/>
           <w:sz w:val="20"/>
         </w:rPr>
-        <w:t>Q: Is self defense useful if I am not athletic?</w:t>
+        <w:t>Q: What kinds of weapons concepts are covered?</w:t>
       </w:r>
     </w:p>
     <w:p>
@@ -4891,7 +4849,7 @@
           <w:i w:val="0"/>
           <w:sz w:val="20"/>
         </w:rPr>
-        <w:t>A: Yes. Self defense at Fury Combat is built around awareness, technique, and decision-making, not raw athleticism.</w:t>
+        <w:t>A: Coverage depends on the client's goals and experience, with an emphasis on awareness, movement, and responsible handling.</w:t>
       </w:r>
     </w:p>
     <w:p>
@@ -4905,7 +4863,7 @@
           <w:color w:val="18181B"/>
           <w:sz w:val="20"/>
         </w:rPr>
-        <w:t>Q: Can this focus on street safety in Brooklyn?</w:t>
+        <w:t>Q: Is this only for advanced practitioners?</w:t>
       </w:r>
     </w:p>
     <w:p>
@@ -4918,7 +4876,7 @@
           <w:i w:val="0"/>
           <w:sz w:val="20"/>
         </w:rPr>
-        <w:t>A: Absolutely. Sessions can be tailored to commuting, neighborhood awareness, and real-world city situations.</w:t>
+        <w:t>A: No. Sessions are tailored to beginners through advanced clients.</w:t>
       </w:r>
     </w:p>
     <w:p>
@@ -4932,7 +4890,7 @@
           <w:color w:val="18181B"/>
           <w:sz w:val="20"/>
         </w:rPr>
-        <w:t>Q: Do you teach awareness and prevention?</w:t>
+        <w:t>Q: Is this private instruction only?</w:t>
       </w:r>
     </w:p>
     <w:p>
@@ -4945,7 +4903,7 @@
           <w:i w:val="0"/>
           <w:sz w:val="20"/>
         </w:rPr>
-        <w:t>A: Yes. Awareness and prevention are core to every self defense session.</w:t>
+        <w:t>A: Yes. All Weapons and Tactics training is private and one-on-one.</w:t>
       </w:r>
     </w:p>
     <w:p>
@@ -4959,7 +4917,7 @@
           <w:color w:val="18181B"/>
           <w:sz w:val="20"/>
         </w:rPr>
-        <w:t>Q: Is this private instruction only?</w:t>
+        <w:t>Q: Can this be combined with other training?</w:t>
       </w:r>
     </w:p>
     <w:p>
@@ -4972,7 +4930,7 @@
           <w:i w:val="0"/>
           <w:sz w:val="20"/>
         </w:rPr>
-        <w:t>A: Yes. All self defense training at Fury Combat is private and tailored to the individual.</w:t>
+        <w:t>A: Yes. Many clients combine Weapons and Tactics with Ninjutsu, MMA, or private instruction sessions.</w:t>
       </w:r>
     </w:p>
     <w:p>
@@ -4999,7 +4957,7 @@
           <w:i w:val="0"/>
           <w:sz w:val="20"/>
         </w:rPr>
-        <w:t>Fury Combat NYC: Self Defense &amp; Combat</w:t>
+        <w:t>Fury Combat NYC: Combat Martial Arts, Self Defense &amp; Survival Tactics</w:t>
       </w:r>
     </w:p>
     <w:p>
@@ -5013,7 +4971,7 @@
           <w:color w:val="52525B"/>
           <w:sz w:val="20"/>
         </w:rPr>
-        <w:t>Grandmaster Dr. David Furie demonstrates the Fury Combat approach to self defense and real-world combat application.</w:t>
+        <w:t>Weapons familiarity, tactical movement, and disciplined response from the Fury Combat survival tactics program.</w:t>
       </w:r>
     </w:p>
     <w:p>
@@ -5027,7 +4985,49 @@
           <w:color w:val="52525B"/>
           <w:sz w:val="19"/>
         </w:rPr>
-        <w:t>https://www.youtube.com/watch?v=lc5-Rp6ZCZE</w:t>
+        <w:t>https://www.youtube.com/watch?v=vdCp0DTsQok</w:t>
+      </w:r>
+    </w:p>
+    <w:p>
+      <w:pPr>
+        <w:spacing w:before="200" w:after="20"/>
+      </w:pPr>
+      <w:r>
+        <w:rPr>
+          <w:b/>
+          <w:i w:val="0"/>
+          <w:color w:val="18181B"/>
+          <w:sz w:val="32"/>
+        </w:rPr>
+        <w:t>Martial Arts &amp; Combat Sports</w:t>
+      </w:r>
+    </w:p>
+    <w:p>
+      <w:pPr>
+        <w:spacing w:before="0" w:after="20"/>
+      </w:pPr>
+      <w:r>
+        <w:rPr>
+          <w:b/>
+          <w:i w:val="0"/>
+          <w:color w:val="DC2626"/>
+          <w:sz w:val="21"/>
+        </w:rPr>
+        <w:t>Competitive Martial Arts &amp; Sport Combat Training</w:t>
+      </w:r>
+    </w:p>
+    <w:p>
+      <w:pPr>
+        <w:spacing w:before="0" w:after="120"/>
+      </w:pPr>
+      <w:r>
+        <w:rPr>
+          <w:b w:val="0"/>
+          <w:i/>
+          <w:color w:val="52525B"/>
+          <w:sz w:val="20"/>
+        </w:rPr>
+        <w:t>Private competitive martial arts instruction in Brooklyn for adults and young athletes who want the sport side of the system, including MMA, Jujitsu, Kickboxing, Ninjutsu, Self Defense, and Weapons and Tactics.</w:t>
       </w:r>
     </w:p>
     <w:p>
@@ -5041,7 +5041,7 @@
           <w:color w:val="18181B"/>
           <w:sz w:val="28"/>
         </w:rPr>
-        <w:t>10. Jujitsu</w:t>
+        <w:t>10. Self Defense</w:t>
       </w:r>
     </w:p>
     <w:p>
@@ -5080,7 +5080,7 @@
           <w:i w:val="0"/>
           <w:sz w:val="20"/>
         </w:rPr>
-        <w:t>/jujitsu-in-brooklyn</w:t>
+        <w:t>/self-defense-in-brooklyn</w:t>
       </w:r>
     </w:p>
     <w:p>
@@ -5094,7 +5094,7 @@
           <w:color w:val="52525B"/>
           <w:sz w:val="21"/>
         </w:rPr>
-        <w:t>Private Jujitsu training in Brooklyn focused on leverage, control, and practical close-combat skill.</w:t>
+        <w:t>Private self defense training in Brooklyn built around awareness, prevention, and decisive real-world response.</w:t>
       </w:r>
     </w:p>
     <w:p>
@@ -5107,7 +5107,7 @@
           <w:i w:val="0"/>
           <w:sz w:val="21"/>
         </w:rPr>
-        <w:t>Jujitsu training at Fury Combat Systems focuses on leverage, positioning, control, and practical close-combat skill. It is designed for clients who want to understand how technique can overcome size, strength, and pressure. Training may include stand-up control, takedown awareness, grappling concepts, balance disruption, and self-defense application.</w:t>
+        <w:t>Self Defense training at Fury Combat Systems is built for real-world readiness. Clients learn practical awareness, prevention, hand-to-hand defense, decisive response, and the mental control needed to act under pressure. The goal is not fear-based training. The goal is confidence, preparation, and the ability to protect yourself and the people who matter to you.</w:t>
       </w:r>
     </w:p>
     <w:p>
@@ -5135,7 +5135,7 @@
           <w:i w:val="0"/>
           <w:sz w:val="20"/>
         </w:rPr>
-        <w:t>Adults learning Jujitsu for self-defense</w:t>
+        <w:t>Adults seeking practical self defense in Brooklyn</w:t>
       </w:r>
     </w:p>
     <w:p>
@@ -5149,7 +5149,7 @@
           <w:i w:val="0"/>
           <w:sz w:val="20"/>
         </w:rPr>
-        <w:t>Martial artists adding grappling skill</w:t>
+        <w:t>Commuters and city residents focused on safety</w:t>
       </w:r>
     </w:p>
     <w:p>
@@ -5163,7 +5163,7 @@
           <w:i w:val="0"/>
           <w:sz w:val="20"/>
         </w:rPr>
-        <w:t>Clients who want technique over brute strength</w:t>
+        <w:t>Beginners with no prior training</w:t>
       </w:r>
     </w:p>
     <w:p>
@@ -5177,7 +5177,7 @@
           <w:i w:val="0"/>
           <w:sz w:val="20"/>
         </w:rPr>
-        <w:t>Beginners seeking private instruction</w:t>
+        <w:t>Women, parents, and professionals</w:t>
       </w:r>
     </w:p>
     <w:p>
@@ -5191,7 +5191,7 @@
           <w:i w:val="0"/>
           <w:sz w:val="20"/>
         </w:rPr>
-        <w:t>Experienced practitioners refining their game</w:t>
+        <w:t>Anyone wanting confidence and personal readiness</w:t>
       </w:r>
     </w:p>
     <w:p>
@@ -5219,7 +5219,7 @@
           <w:i w:val="0"/>
           <w:sz w:val="20"/>
         </w:rPr>
-        <w:t>Private Jujitsu instruction with David Furie</w:t>
+        <w:t>Private one-on-one instruction with David Furie</w:t>
       </w:r>
     </w:p>
     <w:p>
@@ -5233,7 +5233,7 @@
           <w:i w:val="0"/>
           <w:sz w:val="20"/>
         </w:rPr>
-        <w:t>Step-by-step technical development</w:t>
+        <w:t>Awareness, prevention, and response coaching</w:t>
       </w:r>
     </w:p>
     <w:p>
@@ -5247,7 +5247,7 @@
           <w:i w:val="0"/>
           <w:sz w:val="20"/>
         </w:rPr>
-        <w:t>Drilling and live application work</w:t>
+        <w:t>Hands-on defensive skill development</w:t>
       </w:r>
     </w:p>
     <w:p>
@@ -5261,7 +5261,7 @@
           <w:i w:val="0"/>
           <w:sz w:val="20"/>
         </w:rPr>
-        <w:t>Grappling concepts adapted for real-world defense</w:t>
+        <w:t>Training scaled to your fitness and experience level</w:t>
       </w:r>
     </w:p>
     <w:p>
@@ -5275,7 +5275,7 @@
           <w:i w:val="0"/>
           <w:sz w:val="20"/>
         </w:rPr>
-        <w:t>Sessions tailored to your level and goals</w:t>
+        <w:t>Practical tools you can use in real situations</w:t>
       </w:r>
     </w:p>
     <w:p>
@@ -5302,7 +5302,7 @@
           <w:i w:val="0"/>
           <w:sz w:val="20"/>
         </w:rPr>
-        <w:t>Leverage and control  •  Close-combat positioning  •  Balance disruption  •  Defensive grappling  •  Escapes and counters  •  Ground awareness  •  Practical self-defense application  •  Mental discipline</w:t>
+        <w:t>Situational awareness  •  Threat recognition  •  Defensive movement  •  Hand-to-hand protection  •  Using natural body weapons  •  Everyday-object awareness  •  Fear control  •  Confidence under pressure</w:t>
       </w:r>
     </w:p>
     <w:p>
@@ -5330,7 +5330,7 @@
           <w:i w:val="0"/>
           <w:sz w:val="20"/>
         </w:rPr>
-        <w:t>Stronger control in close-range situations</w:t>
+        <w:t>Stronger awareness in everyday environments</w:t>
       </w:r>
     </w:p>
     <w:p>
@@ -5344,7 +5344,7 @@
           <w:i w:val="0"/>
           <w:sz w:val="20"/>
         </w:rPr>
-        <w:t>Better understanding of leverage and positioning</w:t>
+        <w:t>More confidence moving through Brooklyn and the city</w:t>
       </w:r>
     </w:p>
     <w:p>
@@ -5358,7 +5358,7 @@
           <w:i w:val="0"/>
           <w:sz w:val="20"/>
         </w:rPr>
-        <w:t>Improved composure under physical pressure</w:t>
+        <w:t>Practical defensive skill you can actually use</w:t>
       </w:r>
     </w:p>
     <w:p>
@@ -5372,7 +5372,7 @@
           <w:i w:val="0"/>
           <w:sz w:val="20"/>
         </w:rPr>
-        <w:t>Practical grappling skill that applies outside the gym</w:t>
+        <w:t>Better composure under pressure</w:t>
       </w:r>
     </w:p>
     <w:p>
@@ -5386,7 +5386,7 @@
           <w:i w:val="0"/>
           <w:sz w:val="20"/>
         </w:rPr>
-        <w:t>Greater confidence in your defensive ability</w:t>
+        <w:t>A clearer mental framework for personal safety</w:t>
       </w:r>
     </w:p>
     <w:p>
@@ -5413,7 +5413,7 @@
           <w:i w:val="0"/>
           <w:sz w:val="21"/>
         </w:rPr>
-        <w:t>Private Jujitsu instruction with Grandmaster Dr. David Furie focuses on real, practical skill, not sport-only mechanics. You learn at your own pace with direct feedback every session.</w:t>
+        <w:t>This is real self defense built around awareness, prevention, and practical response, taught privately by Grandmaster Dr. David Furie. It is not a generic gym class and it is not fear-based training.</w:t>
       </w:r>
     </w:p>
     <w:p>
@@ -5441,7 +5441,7 @@
           <w:color w:val="18181B"/>
           <w:sz w:val="20"/>
         </w:rPr>
-        <w:t>Q: Do I need prior grappling experience?</w:t>
+        <w:t>Q: Is this beginner-friendly?</w:t>
       </w:r>
     </w:p>
     <w:p>
@@ -5454,7 +5454,7 @@
           <w:i w:val="0"/>
           <w:sz w:val="20"/>
         </w:rPr>
-        <w:t>A: No. Sessions are tailored to your level, from complete beginner through advanced.</w:t>
+        <w:t>A: Yes. Every session is shaped around the client's level, with no prior experience required.</w:t>
       </w:r>
     </w:p>
     <w:p>
@@ -5468,7 +5468,7 @@
           <w:color w:val="18181B"/>
           <w:sz w:val="20"/>
         </w:rPr>
-        <w:t>Q: Is this sport Jujitsu or self-defense Jujitsu?</w:t>
+        <w:t>Q: Is self defense useful if I am not athletic?</w:t>
       </w:r>
     </w:p>
     <w:p>
@@ -5481,7 +5481,7 @@
           <w:i w:val="0"/>
           <w:sz w:val="20"/>
         </w:rPr>
-        <w:t>A: The focus is practical close-combat skill and self-defense application, not sport competition.</w:t>
+        <w:t>A: Yes. Self defense at Fury Combat is built around awareness, technique, and decision-making, not raw athleticism.</w:t>
       </w:r>
     </w:p>
     <w:p>
@@ -5495,7 +5495,7 @@
           <w:color w:val="18181B"/>
           <w:sz w:val="20"/>
         </w:rPr>
-        <w:t>Q: Can technique really overcome a larger attacker?</w:t>
+        <w:t>Q: Can this focus on street safety in Brooklyn?</w:t>
       </w:r>
     </w:p>
     <w:p>
@@ -5508,7 +5508,7 @@
           <w:i w:val="0"/>
           <w:sz w:val="20"/>
         </w:rPr>
-        <w:t>A: Yes. Jujitsu is built on leverage, positioning, and timing, which is exactly why it works against stronger opponents.</w:t>
+        <w:t>A: Absolutely. Sessions can be tailored to commuting, neighborhood awareness, and real-world city situations.</w:t>
       </w:r>
     </w:p>
     <w:p>
@@ -5522,6 +5522,33 @@
           <w:color w:val="18181B"/>
           <w:sz w:val="20"/>
         </w:rPr>
+        <w:t>Q: Do you teach awareness and prevention?</w:t>
+      </w:r>
+    </w:p>
+    <w:p>
+      <w:pPr>
+        <w:spacing w:before="0" w:after="40"/>
+      </w:pPr>
+      <w:r>
+        <w:rPr>
+          <w:b w:val="0"/>
+          <w:i w:val="0"/>
+          <w:sz w:val="20"/>
+        </w:rPr>
+        <w:t>A: Yes. Awareness and prevention are core to every self defense session.</w:t>
+      </w:r>
+    </w:p>
+    <w:p>
+      <w:pPr>
+        <w:spacing w:before="40" w:after="0"/>
+      </w:pPr>
+      <w:r>
+        <w:rPr>
+          <w:b/>
+          <w:i w:val="0"/>
+          <w:color w:val="18181B"/>
+          <w:sz w:val="20"/>
+        </w:rPr>
         <w:t>Q: Is this private instruction only?</w:t>
       </w:r>
     </w:p>
@@ -5535,34 +5562,7 @@
           <w:i w:val="0"/>
           <w:sz w:val="20"/>
         </w:rPr>
-        <w:t>A: Yes. All Jujitsu training at Fury Combat is private and one-on-one.</w:t>
-      </w:r>
-    </w:p>
-    <w:p>
-      <w:pPr>
-        <w:spacing w:before="40" w:after="0"/>
-      </w:pPr>
-      <w:r>
-        <w:rPr>
-          <w:b/>
-          <w:i w:val="0"/>
-          <w:color w:val="18181B"/>
-          <w:sz w:val="20"/>
-        </w:rPr>
-        <w:t>Q: Can this be combined with striking training?</w:t>
-      </w:r>
-    </w:p>
-    <w:p>
-      <w:pPr>
-        <w:spacing w:before="0" w:after="40"/>
-      </w:pPr>
-      <w:r>
-        <w:rPr>
-          <w:b w:val="0"/>
-          <w:i w:val="0"/>
-          <w:sz w:val="20"/>
-        </w:rPr>
-        <w:t>A: Absolutely. Many clients combine Jujitsu sessions with kickboxing or MMA training.</w:t>
+        <w:t>A: Yes. All self defense training at Fury Combat is private and tailored to the individual.</w:t>
       </w:r>
     </w:p>
     <w:p>
@@ -5589,7 +5589,7 @@
           <w:i w:val="0"/>
           <w:sz w:val="20"/>
         </w:rPr>
-        <w:t>Fury Combat NYC: Jujitsu &amp; Self Defense</w:t>
+        <w:t>Fury Combat NYC: Self Defense &amp; Combat</w:t>
       </w:r>
     </w:p>
     <w:p>
@@ -5603,7 +5603,7 @@
           <w:color w:val="52525B"/>
           <w:sz w:val="20"/>
         </w:rPr>
-        <w:t>A look at leverage, control, and practical close-combat skill from the Fury Combat Jujitsu program.</w:t>
+        <w:t>Grandmaster Dr. David Furie demonstrates the Fury Combat approach to self defense and real-world combat application.</w:t>
       </w:r>
     </w:p>
     <w:p>
@@ -5617,7 +5617,7 @@
           <w:color w:val="52525B"/>
           <w:sz w:val="19"/>
         </w:rPr>
-        <w:t>https://www.youtube.com/watch?v=Zu_CTxnVnT0</w:t>
+        <w:t>https://www.youtube.com/watch?v=lc5-Rp6ZCZE</w:t>
       </w:r>
     </w:p>
     <w:p>
@@ -5631,7 +5631,7 @@
           <w:color w:val="18181B"/>
           <w:sz w:val="28"/>
         </w:rPr>
-        <w:t>11. Ninjutsu</w:t>
+        <w:t>11. Jujitsu</w:t>
       </w:r>
     </w:p>
     <w:p>
@@ -5670,7 +5670,7 @@
           <w:i w:val="0"/>
           <w:sz w:val="20"/>
         </w:rPr>
-        <w:t>/ninjutsu-in-brooklyn</w:t>
+        <w:t>/jujitsu-in-brooklyn</w:t>
       </w:r>
     </w:p>
     <w:p>
@@ -5684,7 +5684,7 @@
           <w:color w:val="52525B"/>
           <w:sz w:val="21"/>
         </w:rPr>
-        <w:t>Private Ninjutsu training in Brooklyn built around adaptability, awareness, and practical combat strategy.</w:t>
+        <w:t>Private Jujitsu training in Brooklyn focused on leverage, control, and practical close-combat skill.</w:t>
       </w:r>
     </w:p>
     <w:p>
@@ -5697,7 +5697,7 @@
           <w:i w:val="0"/>
           <w:sz w:val="21"/>
         </w:rPr>
-        <w:t>Ninjutsu training at Fury Combat Systems is built around adaptability, awareness, movement, and practical combat strategy. The training connects hand-to-hand skill, defensive movement, weapons concepts, and mental discipline into a private instruction format shaped around the client's level and goals.</w:t>
+        <w:t>Jujitsu training at Fury Combat Systems focuses on leverage, positioning, control, and practical close-combat skill. It is designed for clients who want to understand how technique can overcome size, strength, and pressure. Training may include stand-up control, takedown awareness, grappling concepts, balance disruption, and self-defense application.</w:t>
       </w:r>
     </w:p>
     <w:p>
@@ -5725,7 +5725,7 @@
           <w:i w:val="0"/>
           <w:sz w:val="20"/>
         </w:rPr>
-        <w:t>Adults drawn to traditional combat arts</w:t>
+        <w:t>Adults learning Jujitsu for self-defense</w:t>
       </w:r>
     </w:p>
     <w:p>
@@ -5739,7 +5739,7 @@
           <w:i w:val="0"/>
           <w:sz w:val="20"/>
         </w:rPr>
-        <w:t>Martial artists seeking adaptability and movement</w:t>
+        <w:t>Martial artists adding grappling skill</w:t>
       </w:r>
     </w:p>
     <w:p>
@@ -5753,7 +5753,7 @@
           <w:i w:val="0"/>
           <w:sz w:val="20"/>
         </w:rPr>
-        <w:t>Clients interested in weapons concepts</w:t>
+        <w:t>Clients who want technique over brute strength</w:t>
       </w:r>
     </w:p>
     <w:p>
@@ -5767,7 +5767,7 @@
           <w:i w:val="0"/>
           <w:sz w:val="20"/>
         </w:rPr>
-        <w:t>Beginners curious about Ninjutsu</w:t>
+        <w:t>Beginners seeking private instruction</w:t>
       </w:r>
     </w:p>
     <w:p>
@@ -5781,7 +5781,7 @@
           <w:i w:val="0"/>
           <w:sz w:val="20"/>
         </w:rPr>
-        <w:t>Practitioners looking for serious private instruction</w:t>
+        <w:t>Experienced practitioners refining their game</w:t>
       </w:r>
     </w:p>
     <w:p>
@@ -5809,7 +5809,7 @@
           <w:i w:val="0"/>
           <w:sz w:val="20"/>
         </w:rPr>
-        <w:t>Private Ninjutsu instruction with David Furie</w:t>
+        <w:t>Private Jujitsu instruction with David Furie</w:t>
       </w:r>
     </w:p>
     <w:p>
@@ -5823,7 +5823,7 @@
           <w:i w:val="0"/>
           <w:sz w:val="20"/>
         </w:rPr>
-        <w:t>Founder-led teaching across multiple ranges of combat</w:t>
+        <w:t>Step-by-step technical development</w:t>
       </w:r>
     </w:p>
     <w:p>
@@ -5837,7 +5837,7 @@
           <w:i w:val="0"/>
           <w:sz w:val="20"/>
         </w:rPr>
-        <w:t>Movement, awareness, and timing development</w:t>
+        <w:t>Drilling and live application work</w:t>
       </w:r>
     </w:p>
     <w:p>
@@ -5851,7 +5851,7 @@
           <w:i w:val="0"/>
           <w:sz w:val="20"/>
         </w:rPr>
-        <w:t>Introduction to weapons concepts where appropriate</w:t>
+        <w:t>Grappling concepts adapted for real-world defense</w:t>
       </w:r>
     </w:p>
     <w:p>
@@ -5865,7 +5865,7 @@
           <w:i w:val="0"/>
           <w:sz w:val="20"/>
         </w:rPr>
-        <w:t>A serious training experience shaped around your goals</w:t>
+        <w:t>Sessions tailored to your level and goals</w:t>
       </w:r>
     </w:p>
     <w:p>
@@ -5892,7 +5892,7 @@
           <w:i w:val="0"/>
           <w:sz w:val="20"/>
         </w:rPr>
-        <w:t>Adaptability  •  Stealth and awareness concepts  •  Hand-to-hand movement  •  Defensive tactics  •  Weapons familiarity  •  Mind-body discipline  •  Precision and timing  •  Real-world application</w:t>
+        <w:t>Leverage and control  •  Close-combat positioning  •  Balance disruption  •  Defensive grappling  •  Escapes and counters  •  Ground awareness  •  Practical self-defense application  •  Mental discipline</w:t>
       </w:r>
     </w:p>
     <w:p>
@@ -5920,7 +5920,7 @@
           <w:i w:val="0"/>
           <w:sz w:val="20"/>
         </w:rPr>
-        <w:t>Greater body awareness and control</w:t>
+        <w:t>Stronger control in close-range situations</w:t>
       </w:r>
     </w:p>
     <w:p>
@@ -5934,7 +5934,7 @@
           <w:i w:val="0"/>
           <w:sz w:val="20"/>
         </w:rPr>
-        <w:t>Improved adaptability under pressure</w:t>
+        <w:t>Better understanding of leverage and positioning</w:t>
       </w:r>
     </w:p>
     <w:p>
@@ -5948,7 +5948,7 @@
           <w:i w:val="0"/>
           <w:sz w:val="20"/>
         </w:rPr>
-        <w:t>Sharper timing and movement</w:t>
+        <w:t>Improved composure under physical pressure</w:t>
       </w:r>
     </w:p>
     <w:p>
@@ -5962,7 +5962,7 @@
           <w:i w:val="0"/>
           <w:sz w:val="20"/>
         </w:rPr>
-        <w:t>Stronger mind-body discipline</w:t>
+        <w:t>Practical grappling skill that applies outside the gym</w:t>
       </w:r>
     </w:p>
     <w:p>
@@ -5976,7 +5976,7 @@
           <w:i w:val="0"/>
           <w:sz w:val="20"/>
         </w:rPr>
-        <w:t>A deeper understanding of combat strategy</w:t>
+        <w:t>Greater confidence in your defensive ability</w:t>
       </w:r>
     </w:p>
     <w:p>
@@ -6003,7 +6003,7 @@
           <w:i w:val="0"/>
           <w:sz w:val="21"/>
         </w:rPr>
-        <w:t>Ninjutsu at Fury Combat is taught privately by Grandmaster Dr. David Furie with a focus on practical adaptability, not theatrical movement. Every session is built around real skill and real readiness.</w:t>
+        <w:t>Private Jujitsu instruction with Grandmaster Dr. David Furie focuses on real, practical skill, not sport-only mechanics. You learn at your own pace with direct feedback every session.</w:t>
       </w:r>
     </w:p>
     <w:p>
@@ -6031,7 +6031,7 @@
           <w:color w:val="18181B"/>
           <w:sz w:val="20"/>
         </w:rPr>
-        <w:t>Q: Is Ninjutsu practical for modern self-defense?</w:t>
+        <w:t>Q: Do I need prior grappling experience?</w:t>
       </w:r>
     </w:p>
     <w:p>
@@ -6044,7 +6044,7 @@
           <w:i w:val="0"/>
           <w:sz w:val="20"/>
         </w:rPr>
-        <w:t>A: Yes. The training emphasizes adaptability, awareness, and real-world application.</w:t>
+        <w:t>A: No. Sessions are tailored to your level, from complete beginner through advanced.</w:t>
       </w:r>
     </w:p>
     <w:p>
@@ -6058,7 +6058,7 @@
           <w:color w:val="18181B"/>
           <w:sz w:val="20"/>
         </w:rPr>
-        <w:t>Q: Do I need prior martial arts experience?</w:t>
+        <w:t>Q: Is this sport Jujitsu or self-defense Jujitsu?</w:t>
       </w:r>
     </w:p>
     <w:p>
@@ -6071,7 +6071,7 @@
           <w:i w:val="0"/>
           <w:sz w:val="20"/>
         </w:rPr>
-        <w:t>A: No. Sessions are tailored to your level, whether beginner or experienced.</w:t>
+        <w:t>A: The focus is practical close-combat skill and self-defense application, not sport competition.</w:t>
       </w:r>
     </w:p>
     <w:p>
@@ -6085,7 +6085,7 @@
           <w:color w:val="18181B"/>
           <w:sz w:val="20"/>
         </w:rPr>
-        <w:t>Q: Are weapons part of the training?</w:t>
+        <w:t>Q: Can technique really overcome a larger attacker?</w:t>
       </w:r>
     </w:p>
     <w:p>
@@ -6098,7 +6098,7 @@
           <w:i w:val="0"/>
           <w:sz w:val="20"/>
         </w:rPr>
-        <w:t>A: Weapons familiarity can be introduced where appropriate, based on the client's goals.</w:t>
+        <w:t>A: Yes. Jujitsu is built on leverage, positioning, and timing, which is exactly why it works against stronger opponents.</w:t>
       </w:r>
     </w:p>
     <w:p>
@@ -6125,7 +6125,7 @@
           <w:i w:val="0"/>
           <w:sz w:val="20"/>
         </w:rPr>
-        <w:t>A: Yes. All Ninjutsu training at Fury Combat is private and one-on-one.</w:t>
+        <w:t>A: Yes. All Jujitsu training at Fury Combat is private and one-on-one.</w:t>
       </w:r>
     </w:p>
     <w:p>
@@ -6139,7 +6139,7 @@
           <w:color w:val="18181B"/>
           <w:sz w:val="20"/>
         </w:rPr>
-        <w:t>Q: How is this different from other martial arts?</w:t>
+        <w:t>Q: Can this be combined with striking training?</w:t>
       </w:r>
     </w:p>
     <w:p>
@@ -6152,7 +6152,7 @@
           <w:i w:val="0"/>
           <w:sz w:val="20"/>
         </w:rPr>
-        <w:t>A: Ninjutsu emphasizes adaptability, movement, awareness, and the integration of multiple combat ranges.</w:t>
+        <w:t>A: Absolutely. Many clients combine Jujitsu sessions with kickboxing or MMA training.</w:t>
       </w:r>
     </w:p>
     <w:p>
@@ -6179,7 +6179,7 @@
           <w:i w:val="0"/>
           <w:sz w:val="20"/>
         </w:rPr>
-        <w:t>Ninjutsu in Brooklyn with Grandmaster Dr. David Furie</w:t>
+        <w:t>Fury Combat NYC: Jujitsu &amp; Self Defense</w:t>
       </w:r>
     </w:p>
     <w:p>
@@ -6193,7 +6193,7 @@
           <w:color w:val="52525B"/>
           <w:sz w:val="20"/>
         </w:rPr>
-        <w:t>Inside the Fury Combat Ninjutsu Shadow Warriors program: adaptability, awareness, and practical combat strategy.</w:t>
+        <w:t>A look at leverage, control, and practical close-combat skill from the Fury Combat Jujitsu program.</w:t>
       </w:r>
     </w:p>
     <w:p>
@@ -6207,7 +6207,7 @@
           <w:color w:val="52525B"/>
           <w:sz w:val="19"/>
         </w:rPr>
-        <w:t>https://www.youtube.com/watch?v=u2DZiwY8WQA</w:t>
+        <w:t>https://www.youtube.com/watch?v=Zu_CTxnVnT0</w:t>
       </w:r>
     </w:p>
     <w:p>
@@ -6221,7 +6221,7 @@
           <w:color w:val="18181B"/>
           <w:sz w:val="28"/>
         </w:rPr>
-        <w:t>12. Kickboxing</w:t>
+        <w:t>12. Ninjutsu</w:t>
       </w:r>
     </w:p>
     <w:p>
@@ -6260,7 +6260,7 @@
           <w:i w:val="0"/>
           <w:sz w:val="20"/>
         </w:rPr>
-        <w:t>/kickboxing-in-brooklyn</w:t>
+        <w:t>/ninjutsu-in-brooklyn</w:t>
       </w:r>
     </w:p>
     <w:p>
@@ -6274,7 +6274,7 @@
           <w:color w:val="52525B"/>
           <w:sz w:val="21"/>
         </w:rPr>
-        <w:t>Private kickboxing training in Brooklyn for striking skill, conditioning, and defensive readiness.</w:t>
+        <w:t>Private Ninjutsu training in Brooklyn built around adaptability, awareness, and practical combat strategy.</w:t>
       </w:r>
     </w:p>
     <w:p>
@@ -6287,7 +6287,7 @@
           <w:i w:val="0"/>
           <w:sz w:val="21"/>
         </w:rPr>
-        <w:t>Kickboxing training at Fury Combat Systems develops powerful striking, movement, conditioning, and practical defensive skill. Clients work on punches, kicks, footwork, guard, balance, timing, and reaction in a private training format that can support fitness, self-defense, or mixed martial arts development.</w:t>
+        <w:t>Ninjutsu training at Fury Combat Systems is built around adaptability, awareness, movement, and practical combat strategy. The training connects hand-to-hand skill, defensive movement, weapons concepts, and mental discipline into a private instruction format shaped around the client's level and goals.</w:t>
       </w:r>
     </w:p>
     <w:p>
@@ -6315,7 +6315,7 @@
           <w:i w:val="0"/>
           <w:sz w:val="20"/>
         </w:rPr>
-        <w:t>Adults learning kickboxing for fitness or self-defense</w:t>
+        <w:t>Adults drawn to traditional combat arts</w:t>
       </w:r>
     </w:p>
     <w:p>
@@ -6329,7 +6329,7 @@
           <w:i w:val="0"/>
           <w:sz w:val="20"/>
         </w:rPr>
-        <w:t>Beginners wanting private striking instruction</w:t>
+        <w:t>Martial artists seeking adaptability and movement</w:t>
       </w:r>
     </w:p>
     <w:p>
@@ -6343,7 +6343,7 @@
           <w:i w:val="0"/>
           <w:sz w:val="20"/>
         </w:rPr>
-        <w:t>Experienced fighters refining technique</w:t>
+        <w:t>Clients interested in weapons concepts</w:t>
       </w:r>
     </w:p>
     <w:p>
@@ -6357,7 +6357,7 @@
           <w:i w:val="0"/>
           <w:sz w:val="20"/>
         </w:rPr>
-        <w:t>MMA-focused clients building striking skill</w:t>
+        <w:t>Beginners curious about Ninjutsu</w:t>
       </w:r>
     </w:p>
     <w:p>
@@ -6371,7 +6371,7 @@
           <w:i w:val="0"/>
           <w:sz w:val="20"/>
         </w:rPr>
-        <w:t>Anyone seeking serious, structured striking training</w:t>
+        <w:t>Practitioners looking for serious private instruction</w:t>
       </w:r>
     </w:p>
     <w:p>
@@ -6399,7 +6399,7 @@
           <w:i w:val="0"/>
           <w:sz w:val="20"/>
         </w:rPr>
-        <w:t>Private kickboxing instruction with David Furie</w:t>
+        <w:t>Private Ninjutsu instruction with David Furie</w:t>
       </w:r>
     </w:p>
     <w:p>
@@ -6413,7 +6413,7 @@
           <w:i w:val="0"/>
           <w:sz w:val="20"/>
         </w:rPr>
-        <w:t>Technical breakdown of punches and kicks</w:t>
+        <w:t>Founder-led teaching across multiple ranges of combat</w:t>
       </w:r>
     </w:p>
     <w:p>
@@ -6427,7 +6427,7 @@
           <w:i w:val="0"/>
           <w:sz w:val="20"/>
         </w:rPr>
-        <w:t>Pad work, footwork, and reaction drills</w:t>
+        <w:t>Movement, awareness, and timing development</w:t>
       </w:r>
     </w:p>
     <w:p>
@@ -6441,7 +6441,7 @@
           <w:i w:val="0"/>
           <w:sz w:val="20"/>
         </w:rPr>
-        <w:t>Conditioning built into the session</w:t>
+        <w:t>Introduction to weapons concepts where appropriate</w:t>
       </w:r>
     </w:p>
     <w:p>
@@ -6455,7 +6455,7 @@
           <w:i w:val="0"/>
           <w:sz w:val="20"/>
         </w:rPr>
-        <w:t>Defensive striking and guard development</w:t>
+        <w:t>A serious training experience shaped around your goals</w:t>
       </w:r>
     </w:p>
     <w:p>
@@ -6482,7 +6482,7 @@
           <w:i w:val="0"/>
           <w:sz w:val="20"/>
         </w:rPr>
-        <w:t>Punching and kicking mechanics  •  Footwork  •  Guard and defensive awareness  •  Balance and coordination  •  Pad work  •  Reaction drills  •  Conditioning  •  Self-defense striking</w:t>
+        <w:t>Adaptability  •  Stealth and awareness concepts  •  Hand-to-hand movement  •  Defensive tactics  •  Weapons familiarity  •  Mind-body discipline  •  Precision and timing  •  Real-world application</w:t>
       </w:r>
     </w:p>
     <w:p>
@@ -6510,7 +6510,7 @@
           <w:i w:val="0"/>
           <w:sz w:val="20"/>
         </w:rPr>
-        <w:t>Sharper, more powerful striking</w:t>
+        <w:t>Greater body awareness and control</w:t>
       </w:r>
     </w:p>
     <w:p>
@@ -6524,7 +6524,7 @@
           <w:i w:val="0"/>
           <w:sz w:val="20"/>
         </w:rPr>
-        <w:t>Improved footwork and movement</w:t>
+        <w:t>Improved adaptability under pressure</w:t>
       </w:r>
     </w:p>
     <w:p>
@@ -6538,7 +6538,7 @@
           <w:i w:val="0"/>
           <w:sz w:val="20"/>
         </w:rPr>
-        <w:t>Better conditioning and stamina</w:t>
+        <w:t>Sharper timing and movement</w:t>
       </w:r>
     </w:p>
     <w:p>
@@ -6552,7 +6552,7 @@
           <w:i w:val="0"/>
           <w:sz w:val="20"/>
         </w:rPr>
-        <w:t>Stronger defensive habits</w:t>
+        <w:t>Stronger mind-body discipline</w:t>
       </w:r>
     </w:p>
     <w:p>
@@ -6566,7 +6566,7 @@
           <w:i w:val="0"/>
           <w:sz w:val="20"/>
         </w:rPr>
-        <w:t>Practical striking skill that translates to self-defense</w:t>
+        <w:t>A deeper understanding of combat strategy</w:t>
       </w:r>
     </w:p>
     <w:p>
@@ -6593,7 +6593,7 @@
           <w:i w:val="0"/>
           <w:sz w:val="21"/>
         </w:rPr>
-        <w:t>Private kickboxing instruction with Grandmaster Dr. David Furie means direct feedback every round, technique built correctly from the start, and a session shaped around your goals.</w:t>
+        <w:t>Ninjutsu at Fury Combat is taught privately by Grandmaster Dr. David Furie with a focus on practical adaptability, not theatrical movement. Every session is built around real skill and real readiness.</w:t>
       </w:r>
     </w:p>
     <w:p>
@@ -6621,7 +6621,7 @@
           <w:color w:val="18181B"/>
           <w:sz w:val="20"/>
         </w:rPr>
-        <w:t>Q: Is this beginner-friendly?</w:t>
+        <w:t>Q: Is Ninjutsu practical for modern self-defense?</w:t>
       </w:r>
     </w:p>
     <w:p>
@@ -6634,7 +6634,7 @@
           <w:i w:val="0"/>
           <w:sz w:val="20"/>
         </w:rPr>
-        <w:t>A: Yes. Every session is scaled to your fitness level and experience.</w:t>
+        <w:t>A: Yes. The training emphasizes adaptability, awareness, and real-world application.</w:t>
       </w:r>
     </w:p>
     <w:p>
@@ -6648,7 +6648,7 @@
           <w:color w:val="18181B"/>
           <w:sz w:val="20"/>
         </w:rPr>
-        <w:t>Q: Will I do pad work and live drilling?</w:t>
+        <w:t>Q: Do I need prior martial arts experience?</w:t>
       </w:r>
     </w:p>
     <w:p>
@@ -6661,7 +6661,7 @@
           <w:i w:val="0"/>
           <w:sz w:val="20"/>
         </w:rPr>
-        <w:t>A: Yes. Pad work, drilling, and reaction work are core parts of the training.</w:t>
+        <w:t>A: No. Sessions are tailored to your level, whether beginner or experienced.</w:t>
       </w:r>
     </w:p>
     <w:p>
@@ -6675,7 +6675,7 @@
           <w:color w:val="18181B"/>
           <w:sz w:val="20"/>
         </w:rPr>
-        <w:t>Q: Is this for fitness or fighting?</w:t>
+        <w:t>Q: Are weapons part of the training?</w:t>
       </w:r>
     </w:p>
     <w:p>
@@ -6688,7 +6688,7 @@
           <w:i w:val="0"/>
           <w:sz w:val="20"/>
         </w:rPr>
-        <w:t>A: It can be either. Sessions can focus on fitness, self-defense, or MMA development based on your goals.</w:t>
+        <w:t>A: Weapons familiarity can be introduced where appropriate, based on the client's goals.</w:t>
       </w:r>
     </w:p>
     <w:p>
@@ -6702,7 +6702,7 @@
           <w:color w:val="18181B"/>
           <w:sz w:val="20"/>
         </w:rPr>
-        <w:t>Q: Do I need my own gear?</w:t>
+        <w:t>Q: Is this private instruction only?</w:t>
       </w:r>
     </w:p>
     <w:p>
@@ -6715,7 +6715,7 @@
           <w:i w:val="0"/>
           <w:sz w:val="20"/>
         </w:rPr>
-        <w:t>A: Some basic gear is helpful, but David will guide you on what you actually need.</w:t>
+        <w:t>A: Yes. All Ninjutsu training at Fury Combat is private and one-on-one.</w:t>
       </w:r>
     </w:p>
     <w:p>
@@ -6729,7 +6729,7 @@
           <w:color w:val="18181B"/>
           <w:sz w:val="20"/>
         </w:rPr>
-        <w:t>Q: Is this private instruction only?</w:t>
+        <w:t>Q: How is this different from other martial arts?</w:t>
       </w:r>
     </w:p>
     <w:p>
@@ -6742,7 +6742,7 @@
           <w:i w:val="0"/>
           <w:sz w:val="20"/>
         </w:rPr>
-        <w:t>A: Yes. All kickboxing training at Fury Combat is private and one-on-one.</w:t>
+        <w:t>A: Ninjutsu emphasizes adaptability, movement, awareness, and the integration of multiple combat ranges.</w:t>
       </w:r>
     </w:p>
     <w:p>
@@ -6769,7 +6769,7 @@
           <w:i w:val="0"/>
           <w:sz w:val="20"/>
         </w:rPr>
-        <w:t>Fury Combat NYC: Kickboxing &amp; MMA</w:t>
+        <w:t>Ninjutsu in Brooklyn with Grandmaster Dr. David Furie</w:t>
       </w:r>
     </w:p>
     <w:p>
@@ -6783,7 +6783,7 @@
           <w:color w:val="52525B"/>
           <w:sz w:val="20"/>
         </w:rPr>
-        <w:t>Striking skill, footwork, and conditioning from the Fury Combat kickboxing and MMA program.</w:t>
+        <w:t>Inside the Fury Combat Ninjutsu Shadow Warriors program: adaptability, awareness, and practical combat strategy.</w:t>
       </w:r>
     </w:p>
     <w:p>
@@ -6797,7 +6797,7 @@
           <w:color w:val="52525B"/>
           <w:sz w:val="19"/>
         </w:rPr>
-        <w:t>https://www.youtube.com/watch?v=EU5wL_VsvEY</w:t>
+        <w:t>https://www.youtube.com/watch?v=u2DZiwY8WQA</w:t>
       </w:r>
     </w:p>
     <w:p>
@@ -6811,7 +6811,7 @@
           <w:color w:val="18181B"/>
           <w:sz w:val="28"/>
         </w:rPr>
-        <w:t>13. Mixed Martial Arts</w:t>
+        <w:t>13. Kickboxing</w:t>
       </w:r>
     </w:p>
     <w:p>
@@ -6850,7 +6850,7 @@
           <w:i w:val="0"/>
           <w:sz w:val="20"/>
         </w:rPr>
-        <w:t>/mixed-martial-arts-in-brooklyn</w:t>
+        <w:t>/kickboxing-in-brooklyn</w:t>
       </w:r>
     </w:p>
     <w:p>
@@ -6864,7 +6864,7 @@
           <w:color w:val="52525B"/>
           <w:sz w:val="21"/>
         </w:rPr>
-        <w:t>Private MMA training in Brooklyn combining striking, grappling, and full-spectrum combat skill.</w:t>
+        <w:t>Private kickboxing training in Brooklyn for striking skill, conditioning, and defensive readiness.</w:t>
       </w:r>
     </w:p>
     <w:p>
@@ -6877,7 +6877,7 @@
           <w:i w:val="0"/>
           <w:sz w:val="21"/>
         </w:rPr>
-        <w:t>Mixed Martial Arts training at Fury Combat Systems combines striking, grappling, clinch awareness, ground control, and practical fighting strategy. Clients learn how different ranges of combat connect, including stand-up fighting, defensive movement, close-range control, and ground awareness.</w:t>
+        <w:t>Kickboxing training at Fury Combat Systems develops powerful striking, movement, conditioning, and practical defensive skill. Clients work on punches, kicks, footwork, guard, balance, timing, and reaction in a private training format that can support fitness, self-defense, or mixed martial arts development.</w:t>
       </w:r>
     </w:p>
     <w:p>
@@ -6905,7 +6905,7 @@
           <w:i w:val="0"/>
           <w:sz w:val="20"/>
         </w:rPr>
-        <w:t>Adults learning MMA in Brooklyn</w:t>
+        <w:t>Adults learning kickboxing for fitness or self-defense</w:t>
       </w:r>
     </w:p>
     <w:p>
@@ -6919,7 +6919,7 @@
           <w:i w:val="0"/>
           <w:sz w:val="20"/>
         </w:rPr>
-        <w:t>Fighters building a complete skill set</w:t>
+        <w:t>Beginners wanting private striking instruction</w:t>
       </w:r>
     </w:p>
     <w:p>
@@ -6933,7 +6933,7 @@
           <w:i w:val="0"/>
           <w:sz w:val="20"/>
         </w:rPr>
-        <w:t>Beginners wanting structured private MMA instruction</w:t>
+        <w:t>Experienced fighters refining technique</w:t>
       </w:r>
     </w:p>
     <w:p>
@@ -6947,7 +6947,7 @@
           <w:i w:val="0"/>
           <w:sz w:val="20"/>
         </w:rPr>
-        <w:t>Martial artists cross-training across disciplines</w:t>
+        <w:t>MMA-focused clients building striking skill</w:t>
       </w:r>
     </w:p>
     <w:p>
@@ -6961,7 +6961,7 @@
           <w:i w:val="0"/>
           <w:sz w:val="20"/>
         </w:rPr>
-        <w:t>Clients seeking full-range combat readiness</w:t>
+        <w:t>Anyone seeking serious, structured striking training</w:t>
       </w:r>
     </w:p>
     <w:p>
@@ -6989,7 +6989,7 @@
           <w:i w:val="0"/>
           <w:sz w:val="20"/>
         </w:rPr>
-        <w:t>Private MMA instruction with David Furie</w:t>
+        <w:t>Private kickboxing instruction with David Furie</w:t>
       </w:r>
     </w:p>
     <w:p>
@@ -7003,7 +7003,7 @@
           <w:i w:val="0"/>
           <w:sz w:val="20"/>
         </w:rPr>
-        <w:t>Training across striking, clinch, and grappling</w:t>
+        <w:t>Technical breakdown of punches and kicks</w:t>
       </w:r>
     </w:p>
     <w:p>
@@ -7017,7 +7017,7 @@
           <w:i w:val="0"/>
           <w:sz w:val="20"/>
         </w:rPr>
-        <w:t>Drilling and applied scenario work</w:t>
+        <w:t>Pad work, footwork, and reaction drills</w:t>
       </w:r>
     </w:p>
     <w:p>
@@ -7031,7 +7031,7 @@
           <w:i w:val="0"/>
           <w:sz w:val="20"/>
         </w:rPr>
-        <w:t>Conditioning and movement built into each session</w:t>
+        <w:t>Conditioning built into the session</w:t>
       </w:r>
     </w:p>
     <w:p>
@@ -7045,7 +7045,7 @@
           <w:i w:val="0"/>
           <w:sz w:val="20"/>
         </w:rPr>
-        <w:t>Sessions tailored to your goals and experience</w:t>
+        <w:t>Defensive striking and guard development</w:t>
       </w:r>
     </w:p>
     <w:p>
@@ -7072,7 +7072,7 @@
           <w:i w:val="0"/>
           <w:sz w:val="20"/>
         </w:rPr>
-        <w:t>Striking  •  Grappling fundamentals  •  Clinch fighting  •  Ground awareness  •  Submission concepts  •  Sprawl-and-brawl strategy  •  Defensive positioning  •  Full-spectrum combat readiness</w:t>
+        <w:t>Punching and kicking mechanics  •  Footwork  •  Guard and defensive awareness  •  Balance and coordination  •  Pad work  •  Reaction drills  •  Conditioning  •  Self-defense striking</w:t>
       </w:r>
     </w:p>
     <w:p>
@@ -7100,7 +7100,7 @@
           <w:i w:val="0"/>
           <w:sz w:val="20"/>
         </w:rPr>
-        <w:t>A more complete fighting skill set</w:t>
+        <w:t>Sharper, more powerful striking</w:t>
       </w:r>
     </w:p>
     <w:p>
@@ -7114,7 +7114,7 @@
           <w:i w:val="0"/>
           <w:sz w:val="20"/>
         </w:rPr>
-        <w:t>Comfort across striking, clinch, and ground ranges</w:t>
+        <w:t>Improved footwork and movement</w:t>
       </w:r>
     </w:p>
     <w:p>
@@ -7128,7 +7128,7 @@
           <w:i w:val="0"/>
           <w:sz w:val="20"/>
         </w:rPr>
-        <w:t>Improved conditioning and movement</w:t>
+        <w:t>Better conditioning and stamina</w:t>
       </w:r>
     </w:p>
     <w:p>
@@ -7142,7 +7142,7 @@
           <w:i w:val="0"/>
           <w:sz w:val="20"/>
         </w:rPr>
-        <w:t>Stronger defensive instincts in every range</w:t>
+        <w:t>Stronger defensive habits</w:t>
       </w:r>
     </w:p>
     <w:p>
@@ -7156,7 +7156,7 @@
           <w:i w:val="0"/>
           <w:sz w:val="20"/>
         </w:rPr>
-        <w:t>Greater confidence in your overall combat ability</w:t>
+        <w:t>Practical striking skill that translates to self-defense</w:t>
       </w:r>
     </w:p>
     <w:p>
@@ -7183,7 +7183,7 @@
           <w:i w:val="0"/>
           <w:sz w:val="21"/>
         </w:rPr>
-        <w:t>Private MMA training with Grandmaster Dr. David Furie connects every range of combat into one coherent system, taught directly with no distractions and no wasted time.</w:t>
+        <w:t>Private kickboxing instruction with Grandmaster Dr. David Furie means direct feedback every round, technique built correctly from the start, and a session shaped around your goals.</w:t>
       </w:r>
     </w:p>
     <w:p>
@@ -7211,7 +7211,7 @@
           <w:color w:val="18181B"/>
           <w:sz w:val="20"/>
         </w:rPr>
-        <w:t>Q: Do I need prior martial arts experience?</w:t>
+        <w:t>Q: Is this beginner-friendly?</w:t>
       </w:r>
     </w:p>
     <w:p>
@@ -7224,7 +7224,7 @@
           <w:i w:val="0"/>
           <w:sz w:val="20"/>
         </w:rPr>
-        <w:t>A: No. Sessions are tailored to your level, from complete beginner through advanced.</w:t>
+        <w:t>A: Yes. Every session is scaled to your fitness level and experience.</w:t>
       </w:r>
     </w:p>
     <w:p>
@@ -7238,7 +7238,7 @@
           <w:color w:val="18181B"/>
           <w:sz w:val="20"/>
         </w:rPr>
-        <w:t>Q: Is this for competition or self-defense?</w:t>
+        <w:t>Q: Will I do pad work and live drilling?</w:t>
       </w:r>
     </w:p>
     <w:p>
@@ -7251,7 +7251,7 @@
           <w:i w:val="0"/>
           <w:sz w:val="20"/>
         </w:rPr>
-        <w:t>A: Either. Sessions can focus on competition preparation, self-defense, or general MMA skill.</w:t>
+        <w:t>A: Yes. Pad work, drilling, and reaction work are core parts of the training.</w:t>
       </w:r>
     </w:p>
     <w:p>
@@ -7265,7 +7265,7 @@
           <w:color w:val="18181B"/>
           <w:sz w:val="20"/>
         </w:rPr>
-        <w:t>Q: Will I train both striking and grappling?</w:t>
+        <w:t>Q: Is this for fitness or fighting?</w:t>
       </w:r>
     </w:p>
     <w:p>
@@ -7278,7 +7278,7 @@
           <w:i w:val="0"/>
           <w:sz w:val="20"/>
         </w:rPr>
-        <w:t>A: Yes. MMA at Fury Combat covers striking, clinch, and ground in an integrated way.</w:t>
+        <w:t>A: It can be either. Sessions can focus on fitness, self-defense, or MMA development based on your goals.</w:t>
       </w:r>
     </w:p>
     <w:p>
@@ -7292,6 +7292,33 @@
           <w:color w:val="18181B"/>
           <w:sz w:val="20"/>
         </w:rPr>
+        <w:t>Q: Do I need my own gear?</w:t>
+      </w:r>
+    </w:p>
+    <w:p>
+      <w:pPr>
+        <w:spacing w:before="0" w:after="40"/>
+      </w:pPr>
+      <w:r>
+        <w:rPr>
+          <w:b w:val="0"/>
+          <w:i w:val="0"/>
+          <w:sz w:val="20"/>
+        </w:rPr>
+        <w:t>A: Some basic gear is helpful, but David will guide you on what you actually need.</w:t>
+      </w:r>
+    </w:p>
+    <w:p>
+      <w:pPr>
+        <w:spacing w:before="40" w:after="0"/>
+      </w:pPr>
+      <w:r>
+        <w:rPr>
+          <w:b/>
+          <w:i w:val="0"/>
+          <w:color w:val="18181B"/>
+          <w:sz w:val="20"/>
+        </w:rPr>
         <w:t>Q: Is this private instruction only?</w:t>
       </w:r>
     </w:p>
@@ -7305,34 +7332,7 @@
           <w:i w:val="0"/>
           <w:sz w:val="20"/>
         </w:rPr>
-        <w:t>A: Yes. All MMA training at Fury Combat is private and one-on-one.</w:t>
-      </w:r>
-    </w:p>
-    <w:p>
-      <w:pPr>
-        <w:spacing w:before="40" w:after="0"/>
-      </w:pPr>
-      <w:r>
-        <w:rPr>
-          <w:b/>
-          <w:i w:val="0"/>
-          <w:color w:val="18181B"/>
-          <w:sz w:val="20"/>
-        </w:rPr>
-        <w:t>Q: Can I focus on just one area?</w:t>
-      </w:r>
-    </w:p>
-    <w:p>
-      <w:pPr>
-        <w:spacing w:before="0" w:after="40"/>
-      </w:pPr>
-      <w:r>
-        <w:rPr>
-          <w:b w:val="0"/>
-          <w:i w:val="0"/>
-          <w:sz w:val="20"/>
-        </w:rPr>
-        <w:t>A: Yes. Sessions can specialize in striking, grappling, or any specific area you want to develop.</w:t>
+        <w:t>A: Yes. All kickboxing training at Fury Combat is private and one-on-one.</w:t>
       </w:r>
     </w:p>
     <w:p>
@@ -7359,7 +7359,7 @@
           <w:i w:val="0"/>
           <w:sz w:val="20"/>
         </w:rPr>
-        <w:t>Fury Combat NYC: Tactics and Defense Training, Episode 1</w:t>
+        <w:t>Fury Combat NYC: Kickboxing &amp; MMA</w:t>
       </w:r>
     </w:p>
     <w:p>
@@ -7373,7 +7373,7 @@
           <w:color w:val="52525B"/>
           <w:sz w:val="20"/>
         </w:rPr>
-        <w:t>An inside look at full-spectrum combat training combining striking, grappling, and real-world tactics.</w:t>
+        <w:t>Striking skill, footwork, and conditioning from the Fury Combat kickboxing and MMA program.</w:t>
       </w:r>
     </w:p>
     <w:p>
@@ -7387,7 +7387,7 @@
           <w:color w:val="52525B"/>
           <w:sz w:val="19"/>
         </w:rPr>
-        <w:t>https://www.youtube.com/watch?v=y-MLTEh0INI</w:t>
+        <w:t>https://www.youtube.com/watch?v=EU5wL_VsvEY</w:t>
       </w:r>
     </w:p>
     <w:p>
@@ -7401,7 +7401,7 @@
           <w:color w:val="18181B"/>
           <w:sz w:val="28"/>
         </w:rPr>
-        <w:t>14. Weapons and Tactics</w:t>
+        <w:t>14. Mixed Martial Arts</w:t>
       </w:r>
     </w:p>
     <w:p>
@@ -7440,7 +7440,7 @@
           <w:i w:val="0"/>
           <w:sz w:val="20"/>
         </w:rPr>
-        <w:t>/weapons-and-tactics-in-brooklyn</w:t>
+        <w:t>/mixed-martial-arts-in-brooklyn</w:t>
       </w:r>
     </w:p>
     <w:p>
@@ -7454,7 +7454,7 @@
           <w:color w:val="52525B"/>
           <w:sz w:val="21"/>
         </w:rPr>
-        <w:t>Private weapons and tactics training in Brooklyn focused on awareness, control, and disciplined response.</w:t>
+        <w:t>Private MMA training in Brooklyn combining striking, grappling, and full-spectrum combat skill.</w:t>
       </w:r>
     </w:p>
     <w:p>
@@ -7467,7 +7467,7 @@
           <w:i w:val="0"/>
           <w:sz w:val="21"/>
         </w:rPr>
-        <w:t>Weapons and Tactics training at Fury Combat Systems introduces clients to practical awareness, tactical movement, weapons familiarity, and disciplined response. The focus is controlled, responsible instruction designed to build readiness, coordination, confidence, and a deeper understanding of real-world defensive situations.</w:t>
+        <w:t>Mixed Martial Arts training at Fury Combat Systems combines striking, grappling, clinch awareness, ground control, and practical fighting strategy. Clients learn how different ranges of combat connect, including stand-up fighting, defensive movement, close-range control, and ground awareness.</w:t>
       </w:r>
     </w:p>
     <w:p>
@@ -7495,7 +7495,7 @@
           <w:i w:val="0"/>
           <w:sz w:val="20"/>
         </w:rPr>
-        <w:t>Adults seeking weapons familiarity and tactical awareness</w:t>
+        <w:t>Adults learning MMA in Brooklyn</w:t>
       </w:r>
     </w:p>
     <w:p>
@@ -7509,7 +7509,7 @@
           <w:i w:val="0"/>
           <w:sz w:val="20"/>
         </w:rPr>
-        <w:t>Martial artists expanding their training</w:t>
+        <w:t>Fighters building a complete skill set</w:t>
       </w:r>
     </w:p>
     <w:p>
@@ -7523,7 +7523,7 @@
           <w:i w:val="0"/>
           <w:sz w:val="20"/>
         </w:rPr>
-        <w:t>Clients focused on serious personal readiness</w:t>
+        <w:t>Beginners wanting structured private MMA instruction</w:t>
       </w:r>
     </w:p>
     <w:p>
@@ -7537,7 +7537,7 @@
           <w:i w:val="0"/>
           <w:sz w:val="20"/>
         </w:rPr>
-        <w:t>Beginners wanting responsible, disciplined instruction</w:t>
+        <w:t>Martial artists cross-training across disciplines</w:t>
       </w:r>
     </w:p>
     <w:p>
@@ -7551,7 +7551,7 @@
           <w:i w:val="0"/>
           <w:sz w:val="20"/>
         </w:rPr>
-        <w:t>Experienced practitioners refining tactical skill</w:t>
+        <w:t>Clients seeking full-range combat readiness</w:t>
       </w:r>
     </w:p>
     <w:p>
@@ -7579,7 +7579,7 @@
           <w:i w:val="0"/>
           <w:sz w:val="20"/>
         </w:rPr>
-        <w:t>Private weapons and tactics instruction with David Furie</w:t>
+        <w:t>Private MMA instruction with David Furie</w:t>
       </w:r>
     </w:p>
     <w:p>
@@ -7593,7 +7593,7 @@
           <w:i w:val="0"/>
           <w:sz w:val="20"/>
         </w:rPr>
-        <w:t>Responsible, controlled introduction to weapons concepts</w:t>
+        <w:t>Training across striking, clinch, and grappling</w:t>
       </w:r>
     </w:p>
     <w:p>
@@ -7607,7 +7607,7 @@
           <w:i w:val="0"/>
           <w:sz w:val="20"/>
         </w:rPr>
-        <w:t>Tactical movement and awareness drills</w:t>
+        <w:t>Drilling and applied scenario work</w:t>
       </w:r>
     </w:p>
     <w:p>
@@ -7621,7 +7621,7 @@
           <w:i w:val="0"/>
           <w:sz w:val="20"/>
         </w:rPr>
-        <w:t>Coordination and timing development</w:t>
+        <w:t>Conditioning and movement built into each session</w:t>
       </w:r>
     </w:p>
     <w:p>
@@ -7635,7 +7635,7 @@
           <w:i w:val="0"/>
           <w:sz w:val="20"/>
         </w:rPr>
-        <w:t>A serious training experience shaped around your goals</w:t>
+        <w:t>Sessions tailored to your goals and experience</w:t>
       </w:r>
     </w:p>
     <w:p>
@@ -7662,7 +7662,7 @@
           <w:i w:val="0"/>
           <w:sz w:val="20"/>
         </w:rPr>
-        <w:t>Weapons familiarity  •  Tactical movement  •  Awareness and distance  •  Responsible control  •  Defensive positioning  •  Improvised-object awareness  •  Coordination and timing  •  Practical readiness</w:t>
+        <w:t>Striking  •  Grappling fundamentals  •  Clinch fighting  •  Ground awareness  •  Submission concepts  •  Sprawl-and-brawl strategy  •  Defensive positioning  •  Full-spectrum combat readiness</w:t>
       </w:r>
     </w:p>
     <w:p>
@@ -7690,7 +7690,7 @@
           <w:i w:val="0"/>
           <w:sz w:val="20"/>
         </w:rPr>
-        <w:t>Greater tactical awareness in real environments</w:t>
+        <w:t>A more complete fighting skill set</w:t>
       </w:r>
     </w:p>
     <w:p>
@@ -7704,7 +7704,7 @@
           <w:i w:val="0"/>
           <w:sz w:val="20"/>
         </w:rPr>
-        <w:t>Stronger discipline and control</w:t>
+        <w:t>Comfort across striking, clinch, and ground ranges</w:t>
       </w:r>
     </w:p>
     <w:p>
@@ -7718,7 +7718,7 @@
           <w:i w:val="0"/>
           <w:sz w:val="20"/>
         </w:rPr>
-        <w:t>Improved coordination and timing</w:t>
+        <w:t>Improved conditioning and movement</w:t>
       </w:r>
     </w:p>
     <w:p>
@@ -7732,7 +7732,7 @@
           <w:i w:val="0"/>
           <w:sz w:val="20"/>
         </w:rPr>
-        <w:t>Better understanding of defensive movement</w:t>
+        <w:t>Stronger defensive instincts in every range</w:t>
       </w:r>
     </w:p>
     <w:p>
@@ -7746,7 +7746,7 @@
           <w:i w:val="0"/>
           <w:sz w:val="20"/>
         </w:rPr>
-        <w:t>A more complete personal readiness skill set</w:t>
+        <w:t>Greater confidence in your overall combat ability</w:t>
       </w:r>
     </w:p>
     <w:p>
@@ -7773,7 +7773,7 @@
           <w:i w:val="0"/>
           <w:sz w:val="21"/>
         </w:rPr>
-        <w:t>Weapons and Tactics training at Fury Combat is serious, controlled, and taught privately by Grandmaster Dr. David Furie. The focus is responsibility, awareness, and real skill, not flash.</w:t>
+        <w:t>Private MMA training with Grandmaster Dr. David Furie connects every range of combat into one coherent system, taught directly with no distractions and no wasted time.</w:t>
       </w:r>
     </w:p>
     <w:p>
@@ -7801,7 +7801,7 @@
           <w:color w:val="18181B"/>
           <w:sz w:val="20"/>
         </w:rPr>
-        <w:t>Q: Is this safe for beginners?</w:t>
+        <w:t>Q: Do I need prior martial arts experience?</w:t>
       </w:r>
     </w:p>
     <w:p>
@@ -7814,7 +7814,7 @@
           <w:i w:val="0"/>
           <w:sz w:val="20"/>
         </w:rPr>
-        <w:t>A: Yes. Training is responsible, controlled, and scaled to the client's level.</w:t>
+        <w:t>A: No. Sessions are tailored to your level, from complete beginner through advanced.</w:t>
       </w:r>
     </w:p>
     <w:p>
@@ -7828,7 +7828,7 @@
           <w:color w:val="18181B"/>
           <w:sz w:val="20"/>
         </w:rPr>
-        <w:t>Q: What kinds of weapons concepts are covered?</w:t>
+        <w:t>Q: Is this for competition or self-defense?</w:t>
       </w:r>
     </w:p>
     <w:p>
@@ -7841,7 +7841,7 @@
           <w:i w:val="0"/>
           <w:sz w:val="20"/>
         </w:rPr>
-        <w:t>A: Coverage depends on the client's goals and experience, with an emphasis on awareness, movement, and responsible handling.</w:t>
+        <w:t>A: Either. Sessions can focus on competition preparation, self-defense, or general MMA skill.</w:t>
       </w:r>
     </w:p>
     <w:p>
@@ -7855,7 +7855,7 @@
           <w:color w:val="18181B"/>
           <w:sz w:val="20"/>
         </w:rPr>
-        <w:t>Q: Is this only for advanced practitioners?</w:t>
+        <w:t>Q: Will I train both striking and grappling?</w:t>
       </w:r>
     </w:p>
     <w:p>
@@ -7868,7 +7868,7 @@
           <w:i w:val="0"/>
           <w:sz w:val="20"/>
         </w:rPr>
-        <w:t>A: No. Sessions are tailored to beginners through advanced clients.</w:t>
+        <w:t>A: Yes. MMA at Fury Combat covers striking, clinch, and ground in an integrated way.</w:t>
       </w:r>
     </w:p>
     <w:p>
@@ -7895,7 +7895,7 @@
           <w:i w:val="0"/>
           <w:sz w:val="20"/>
         </w:rPr>
-        <w:t>A: Yes. All Weapons and Tactics training is private and one-on-one.</w:t>
+        <w:t>A: Yes. All MMA training at Fury Combat is private and one-on-one.</w:t>
       </w:r>
     </w:p>
     <w:p>
@@ -7909,7 +7909,7 @@
           <w:color w:val="18181B"/>
           <w:sz w:val="20"/>
         </w:rPr>
-        <w:t>Q: Can this be combined with other training?</w:t>
+        <w:t>Q: Can I focus on just one area?</w:t>
       </w:r>
     </w:p>
     <w:p>
@@ -7922,7 +7922,7 @@
           <w:i w:val="0"/>
           <w:sz w:val="20"/>
         </w:rPr>
-        <w:t>A: Yes. Many clients combine Weapons and Tactics with Ninjutsu, MMA, or private instruction sessions.</w:t>
+        <w:t>A: Yes. Sessions can specialize in striking, grappling, or any specific area you want to develop.</w:t>
       </w:r>
     </w:p>
     <w:p>
@@ -7949,7 +7949,7 @@
           <w:i w:val="0"/>
           <w:sz w:val="20"/>
         </w:rPr>
-        <w:t>Fury Combat NYC: Combat Martial Arts, Self Defense &amp; Survival Tactics</w:t>
+        <w:t>Fury Combat NYC: Tactics and Defense Training, Episode 1</w:t>
       </w:r>
     </w:p>
     <w:p>
@@ -7963,7 +7963,7 @@
           <w:color w:val="52525B"/>
           <w:sz w:val="20"/>
         </w:rPr>
-        <w:t>Weapons familiarity, tactical movement, and disciplined response from the Fury Combat survival tactics program.</w:t>
+        <w:t>An inside look at full-spectrum combat training combining striking, grappling, and real-world tactics.</w:t>
       </w:r>
     </w:p>
     <w:p>
@@ -7977,7 +7977,7 @@
           <w:color w:val="52525B"/>
           <w:sz w:val="19"/>
         </w:rPr>
-        <w:t>https://www.youtube.com/watch?v=vdCp0DTsQok</w:t>
+        <w:t>https://www.youtube.com/watch?v=y-MLTEh0INI</w:t>
       </w:r>
     </w:p>
     <w:sectPr>

</xml_diff>

<commit_message>
Remove all pricing information from services and website display
Removes the 'price' field from service data structures in `services.ts` and `Home.tsx`, updates the document generation script to exclude pricing, and regenerates the service document.

Replit-Commit-Author: Agent
Replit-Commit-Session-Id: 43aedacb-9d22-48c3-86be-6e4194244c57
Replit-Commit-Checkpoint-Type: full_checkpoint
Replit-Commit-Event-Id: d3622fc3-7f96-42ab-8944-48320e6ad922
Replit-Commit-Screenshot-Url: https://storage.googleapis.com/screenshot-production-us-central1/3aef1f33-446e-46d9-8cba-659142b2096e/43aedacb-9d22-48c3-86be-6e4194244c57/KoHBKjr
Replit-Helium-Checkpoint-Created: true
</commit_message>
<xml_diff>
--- a/Fury-Combat-Systems-Services.docx
+++ b/Fury-Combat-Systems-Services.docx
@@ -129,23 +129,6 @@
           <w:color w:val="DC2626"/>
           <w:sz w:val="20"/>
         </w:rPr>
-        <w:t xml:space="preserve">Price: </w:t>
-      </w:r>
-      <w:r>
-        <w:rPr>
-          <w:b w:val="0"/>
-          <w:i w:val="0"/>
-          <w:sz w:val="20"/>
-        </w:rPr>
-        <w:t xml:space="preserve">$250 / session      </w:t>
-      </w:r>
-      <w:r>
-        <w:rPr>
-          <w:b/>
-          <w:i w:val="0"/>
-          <w:color w:val="DC2626"/>
-          <w:sz w:val="20"/>
-        </w:rPr>
         <w:t xml:space="preserve">Page: </w:t>
       </w:r>
       <w:r>
@@ -678,23 +661,6 @@
           <w:color w:val="DC2626"/>
           <w:sz w:val="20"/>
         </w:rPr>
-        <w:t xml:space="preserve">Price: </w:t>
-      </w:r>
-      <w:r>
-        <w:rPr>
-          <w:b w:val="0"/>
-          <w:i w:val="0"/>
-          <w:sz w:val="20"/>
-        </w:rPr>
-        <w:t xml:space="preserve">$500 / session      </w:t>
-      </w:r>
-      <w:r>
-        <w:rPr>
-          <w:b/>
-          <w:i w:val="0"/>
-          <w:color w:val="DC2626"/>
-          <w:sz w:val="20"/>
-        </w:rPr>
         <w:t xml:space="preserve">Page: </w:t>
       </w:r>
       <w:r>
@@ -1213,23 +1179,6 @@
           <w:color w:val="DC2626"/>
           <w:sz w:val="20"/>
         </w:rPr>
-        <w:t xml:space="preserve">Price: </w:t>
-      </w:r>
-      <w:r>
-        <w:rPr>
-          <w:b w:val="0"/>
-          <w:i w:val="0"/>
-          <w:sz w:val="20"/>
-        </w:rPr>
-        <w:t xml:space="preserve">$300 / session      </w:t>
-      </w:r>
-      <w:r>
-        <w:rPr>
-          <w:b/>
-          <w:i w:val="0"/>
-          <w:color w:val="DC2626"/>
-          <w:sz w:val="20"/>
-        </w:rPr>
         <w:t xml:space="preserve">Page: </w:t>
       </w:r>
       <w:r>
@@ -1748,23 +1697,6 @@
           <w:color w:val="DC2626"/>
           <w:sz w:val="20"/>
         </w:rPr>
-        <w:t xml:space="preserve">Price: </w:t>
-      </w:r>
-      <w:r>
-        <w:rPr>
-          <w:b w:val="0"/>
-          <w:i w:val="0"/>
-          <w:sz w:val="20"/>
-        </w:rPr>
-        <w:t xml:space="preserve">$150 / session      </w:t>
-      </w:r>
-      <w:r>
-        <w:rPr>
-          <w:b/>
-          <w:i w:val="0"/>
-          <w:color w:val="DC2626"/>
-          <w:sz w:val="20"/>
-        </w:rPr>
         <w:t xml:space="preserve">Page: </w:t>
       </w:r>
       <w:r>
@@ -2283,23 +2215,6 @@
           <w:color w:val="DC2626"/>
           <w:sz w:val="20"/>
         </w:rPr>
-        <w:t xml:space="preserve">Price: </w:t>
-      </w:r>
-      <w:r>
-        <w:rPr>
-          <w:b w:val="0"/>
-          <w:i w:val="0"/>
-          <w:sz w:val="20"/>
-        </w:rPr>
-        <w:t xml:space="preserve">$225 / session      </w:t>
-      </w:r>
-      <w:r>
-        <w:rPr>
-          <w:b/>
-          <w:i w:val="0"/>
-          <w:color w:val="DC2626"/>
-          <w:sz w:val="20"/>
-        </w:rPr>
         <w:t xml:space="preserve">Page: </w:t>
       </w:r>
       <w:r>
@@ -2818,23 +2733,6 @@
           <w:color w:val="DC2626"/>
           <w:sz w:val="20"/>
         </w:rPr>
-        <w:t xml:space="preserve">Price: </w:t>
-      </w:r>
-      <w:r>
-        <w:rPr>
-          <w:b w:val="0"/>
-          <w:i w:val="0"/>
-          <w:sz w:val="20"/>
-        </w:rPr>
-        <w:t xml:space="preserve">$400 / session      </w:t>
-      </w:r>
-      <w:r>
-        <w:rPr>
-          <w:b/>
-          <w:i w:val="0"/>
-          <w:color w:val="DC2626"/>
-          <w:sz w:val="20"/>
-        </w:rPr>
         <w:t xml:space="preserve">Page: </w:t>
       </w:r>
       <w:r>
@@ -3353,23 +3251,6 @@
           <w:color w:val="DC2626"/>
           <w:sz w:val="20"/>
         </w:rPr>
-        <w:t xml:space="preserve">Price: </w:t>
-      </w:r>
-      <w:r>
-        <w:rPr>
-          <w:b w:val="0"/>
-          <w:i w:val="0"/>
-          <w:sz w:val="20"/>
-        </w:rPr>
-        <w:t xml:space="preserve">$350 / session      </w:t>
-      </w:r>
-      <w:r>
-        <w:rPr>
-          <w:b/>
-          <w:i w:val="0"/>
-          <w:color w:val="DC2626"/>
-          <w:sz w:val="20"/>
-        </w:rPr>
         <w:t xml:space="preserve">Page: </w:t>
       </w:r>
       <w:r>
@@ -3888,23 +3769,6 @@
           <w:color w:val="DC2626"/>
           <w:sz w:val="20"/>
         </w:rPr>
-        <w:t xml:space="preserve">Price: </w:t>
-      </w:r>
-      <w:r>
-        <w:rPr>
-          <w:b w:val="0"/>
-          <w:i w:val="0"/>
-          <w:sz w:val="20"/>
-        </w:rPr>
-        <w:t xml:space="preserve">Starting at $1,500      </w:t>
-      </w:r>
-      <w:r>
-        <w:rPr>
-          <w:b/>
-          <w:i w:val="0"/>
-          <w:color w:val="DC2626"/>
-          <w:sz w:val="20"/>
-        </w:rPr>
         <w:t xml:space="preserve">Page: </w:t>
       </w:r>
       <w:r>
@@ -4423,23 +4287,6 @@
           <w:color w:val="DC2626"/>
           <w:sz w:val="20"/>
         </w:rPr>
-        <w:t xml:space="preserve">Price: </w:t>
-      </w:r>
-      <w:r>
-        <w:rPr>
-          <w:b w:val="0"/>
-          <w:i w:val="0"/>
-          <w:sz w:val="20"/>
-        </w:rPr>
-        <w:t xml:space="preserve">Custom pricing (by inquiry)      </w:t>
-      </w:r>
-      <w:r>
-        <w:rPr>
-          <w:b/>
-          <w:i w:val="0"/>
-          <w:color w:val="DC2626"/>
-          <w:sz w:val="20"/>
-        </w:rPr>
         <w:t xml:space="preserve">Page: </w:t>
       </w:r>
       <w:r>
@@ -5055,23 +4902,6 @@
           <w:color w:val="DC2626"/>
           <w:sz w:val="20"/>
         </w:rPr>
-        <w:t xml:space="preserve">Price: </w:t>
-      </w:r>
-      <w:r>
-        <w:rPr>
-          <w:b w:val="0"/>
-          <w:i w:val="0"/>
-          <w:sz w:val="20"/>
-        </w:rPr>
-        <w:t xml:space="preserve">Custom pricing (by inquiry)      </w:t>
-      </w:r>
-      <w:r>
-        <w:rPr>
-          <w:b/>
-          <w:i w:val="0"/>
-          <w:color w:val="DC2626"/>
-          <w:sz w:val="20"/>
-        </w:rPr>
         <w:t xml:space="preserve">Page: </w:t>
       </w:r>
       <w:r>
@@ -5645,23 +5475,6 @@
           <w:color w:val="DC2626"/>
           <w:sz w:val="20"/>
         </w:rPr>
-        <w:t xml:space="preserve">Price: </w:t>
-      </w:r>
-      <w:r>
-        <w:rPr>
-          <w:b w:val="0"/>
-          <w:i w:val="0"/>
-          <w:sz w:val="20"/>
-        </w:rPr>
-        <w:t xml:space="preserve">Custom pricing (by inquiry)      </w:t>
-      </w:r>
-      <w:r>
-        <w:rPr>
-          <w:b/>
-          <w:i w:val="0"/>
-          <w:color w:val="DC2626"/>
-          <w:sz w:val="20"/>
-        </w:rPr>
         <w:t xml:space="preserve">Page: </w:t>
       </w:r>
       <w:r>
@@ -6235,23 +6048,6 @@
           <w:color w:val="DC2626"/>
           <w:sz w:val="20"/>
         </w:rPr>
-        <w:t xml:space="preserve">Price: </w:t>
-      </w:r>
-      <w:r>
-        <w:rPr>
-          <w:b w:val="0"/>
-          <w:i w:val="0"/>
-          <w:sz w:val="20"/>
-        </w:rPr>
-        <w:t xml:space="preserve">Custom pricing (by inquiry)      </w:t>
-      </w:r>
-      <w:r>
-        <w:rPr>
-          <w:b/>
-          <w:i w:val="0"/>
-          <w:color w:val="DC2626"/>
-          <w:sz w:val="20"/>
-        </w:rPr>
         <w:t xml:space="preserve">Page: </w:t>
       </w:r>
       <w:r>
@@ -6825,23 +6621,6 @@
           <w:color w:val="DC2626"/>
           <w:sz w:val="20"/>
         </w:rPr>
-        <w:t xml:space="preserve">Price: </w:t>
-      </w:r>
-      <w:r>
-        <w:rPr>
-          <w:b w:val="0"/>
-          <w:i w:val="0"/>
-          <w:sz w:val="20"/>
-        </w:rPr>
-        <w:t xml:space="preserve">Custom pricing (by inquiry)      </w:t>
-      </w:r>
-      <w:r>
-        <w:rPr>
-          <w:b/>
-          <w:i w:val="0"/>
-          <w:color w:val="DC2626"/>
-          <w:sz w:val="20"/>
-        </w:rPr>
         <w:t xml:space="preserve">Page: </w:t>
       </w:r>
       <w:r>
@@ -7408,23 +7187,6 @@
       <w:pPr>
         <w:spacing w:before="0" w:after="40"/>
       </w:pPr>
-      <w:r>
-        <w:rPr>
-          <w:b/>
-          <w:i w:val="0"/>
-          <w:color w:val="DC2626"/>
-          <w:sz w:val="20"/>
-        </w:rPr>
-        <w:t xml:space="preserve">Price: </w:t>
-      </w:r>
-      <w:r>
-        <w:rPr>
-          <w:b w:val="0"/>
-          <w:i w:val="0"/>
-          <w:sz w:val="20"/>
-        </w:rPr>
-        <w:t xml:space="preserve">Custom pricing (by inquiry)      </w:t>
-      </w:r>
       <w:r>
         <w:rPr>
           <w:b/>

</xml_diff>